<commit_message>
add exercise day 132 hash map
</commit_message>
<xml_diff>
--- a/leetcode/3.Hashing/4.Counting.docx
+++ b/leetcode/3.Hashing/4.Counting.docx
@@ -3377,6 +3377,7 @@
       <w:r>
         <w:rPr>
           <w:rFonts w:ascii="Segoe UI" w:eastAsia="Times New Roman" w:hAnsi="Segoe UI" w:cs="Segoe UI"/>
+          <w:noProof/>
           <w:color w:val="5A5A5A"/>
           <w:kern w:val="0"/>
           <w14:ligatures w14:val="none"/>
@@ -3791,6 +3792,7 @@
       <w:r>
         <w:rPr>
           <w:rFonts w:ascii="Segoe UI" w:eastAsia="Times New Roman" w:hAnsi="Segoe UI" w:cs="Segoe UI"/>
+          <w:noProof/>
           <w:color w:val="5A5A5A"/>
           <w:kern w:val="0"/>
           <w14:ligatures w14:val="none"/>
@@ -5418,11 +5420,10 @@
           <w:kern w:val="0"/>
           <w14:ligatures w14:val="none"/>
         </w:rPr>
-        <w:lastRenderedPageBreak/>
         <w:drawing>
-          <wp:inline distT="0" distB="0" distL="0" distR="0" wp14:anchorId="08C44B16" wp14:editId="6D814E5A">
-            <wp:extent cx="9144000" cy="5141595"/>
-            <wp:effectExtent l="0" t="0" r="0" b="1905"/>
+          <wp:inline distT="0" distB="0" distL="0" distR="0" wp14:anchorId="08C44B16" wp14:editId="3EFB9CC8">
+            <wp:extent cx="5929384" cy="3334043"/>
+            <wp:effectExtent l="0" t="0" r="0" b="0"/>
             <wp:docPr id="17" name="Picture 4" descr="prefix sum example"/>
             <wp:cNvGraphicFramePr>
               <a:graphicFrameLocks xmlns:a="http://schemas.openxmlformats.org/drawingml/2006/main" noChangeAspect="1"/>
@@ -5452,7 +5453,7 @@
                   <pic:spPr bwMode="auto">
                     <a:xfrm>
                       <a:off x="0" y="0"/>
-                      <a:ext cx="9144000" cy="5141595"/>
+                      <a:ext cx="5951478" cy="3346466"/>
                     </a:xfrm>
                     <a:prstGeom prst="rect">
                       <a:avLst/>
@@ -5646,6 +5647,7 @@
           <w:kern w:val="0"/>
           <w14:ligatures w14:val="none"/>
         </w:rPr>
+        <w:lastRenderedPageBreak/>
         <w:t>At some point earlier, </w:t>
       </w:r>
       <w:proofErr w:type="spellStart"/>
@@ -5990,17 +5992,7 @@
           <w:kern w:val="0"/>
           <w14:ligatures w14:val="none"/>
         </w:rPr>
-        <w:t xml:space="preserve"> occurred multiple times before (due to negative numbers or zero), then each of those </w:t>
-      </w:r>
-      <w:r>
-        <w:rPr>
-          <w:rFonts w:ascii="Segoe UI" w:eastAsia="Times New Roman" w:hAnsi="Segoe UI" w:cs="Segoe UI"/>
-          <w:color w:val="5A5A5A"/>
-          <w:kern w:val="0"/>
-          <w14:ligatures w14:val="none"/>
-        </w:rPr>
-        <w:lastRenderedPageBreak/>
-        <w:t>prefixes could be used as a starting point to form a subarray ending at the current index with a sum of </w:t>
+        <w:t> occurred multiple times before (due to negative numbers or zero), then each of those prefixes could be used as a starting point to form a subarray ending at the current index with a sum of </w:t>
       </w:r>
       <w:r>
         <w:rPr>
@@ -6989,6 +6981,7 @@
           <w:kern w:val="0"/>
           <w14:ligatures w14:val="none"/>
         </w:rPr>
+        <w:lastRenderedPageBreak/>
         <w:t>Let's walk through an example to see why the algorithm described above works for this problem. Let's say we have </w:t>
       </w:r>
       <w:proofErr w:type="spellStart"/>
@@ -7340,17 +7333,7 @@
           <w:kern w:val="0"/>
           <w14:ligatures w14:val="none"/>
         </w:rPr>
-        <w:t xml:space="preserve">, considering the empty prefix. This is because if there is a prefix with a </w:t>
-      </w:r>
-      <w:r>
-        <w:rPr>
-          <w:rFonts w:ascii="Segoe UI" w:eastAsia="Times New Roman" w:hAnsi="Segoe UI" w:cs="Segoe UI"/>
-          <w:color w:val="5A5A5A"/>
-          <w:kern w:val="0"/>
-          <w14:ligatures w14:val="none"/>
-        </w:rPr>
-        <w:lastRenderedPageBreak/>
-        <w:t>sum equal to </w:t>
+        <w:t>, considering the empty prefix. This is because if there is a prefix with a sum equal to </w:t>
       </w:r>
       <w:r>
         <w:rPr>
@@ -8460,6 +8443,7 @@
           <w:kern w:val="0"/>
           <w14:ligatures w14:val="none"/>
         </w:rPr>
+        <w:lastRenderedPageBreak/>
         <w:t>Because the array can have negative numbers, the same prefix can occur multiple times. We use a hash map </w:t>
       </w:r>
       <w:r>
@@ -8803,7 +8787,6 @@
           <w:kern w:val="0"/>
           <w14:ligatures w14:val="none"/>
         </w:rPr>
-        <w:lastRenderedPageBreak/>
         <w:t>Example 5: </w:t>
       </w:r>
       <w:hyperlink r:id="rId17" w:tgtFrame="_blank" w:history="1">
@@ -9720,6 +9703,7 @@
           <w:kern w:val="0"/>
           <w14:ligatures w14:val="none"/>
         </w:rPr>
+        <w:lastRenderedPageBreak/>
         <w:pict w14:anchorId="21019AEA">
           <v:rect id="_x0000_i1030" style="width:0;height:.75pt" o:hralign="center" o:hrstd="t" o:hr="t" fillcolor="#a0a0a0" stroked="f"/>
         </w:pict>

</xml_diff>

<commit_message>
add exercise day 133 count hash map
</commit_message>
<xml_diff>
--- a/leetcode/3.Hashing/4.Counting.docx
+++ b/leetcode/3.Hashing/4.Counting.docx
@@ -9536,20 +9536,595 @@
         <w:spacing w:after="0" w:line="240" w:lineRule="auto"/>
         <w:rPr>
           <w:rFonts w:ascii="Segoe UI" w:eastAsia="Times New Roman" w:hAnsi="Segoe UI" w:cs="Segoe UI"/>
-          <w:kern w:val="0"/>
-          <w14:ligatures w14:val="none"/>
-        </w:rPr>
-      </w:pPr>
-      <w:r>
-        <w:rPr>
-          <w:rFonts w:ascii="Segoe UI" w:eastAsia="Times New Roman" w:hAnsi="Segoe UI" w:cs="Segoe UI"/>
           <w:b/>
           <w:bCs/>
           <w:kern w:val="0"/>
           <w:bdr w:val="single" w:sz="2" w:space="0" w:color="auto" w:frame="1"/>
           <w14:ligatures w14:val="none"/>
         </w:rPr>
+      </w:pPr>
+      <w:r>
+        <w:rPr>
+          <w:rFonts w:ascii="Segoe UI" w:eastAsia="Times New Roman" w:hAnsi="Segoe UI" w:cs="Segoe UI"/>
+          <w:b/>
+          <w:bCs/>
+          <w:kern w:val="0"/>
+          <w:bdr w:val="single" w:sz="2" w:space="0" w:color="auto" w:frame="1"/>
+          <w14:ligatures w14:val="none"/>
+        </w:rPr>
         <w:t>Click here for a more detailed explanation if needed</w:t>
+      </w:r>
+    </w:p>
+    <w:p>
+      <w:pPr>
+        <w:shd w:val="clear" w:color="auto" w:fill="FFFFFF"/>
+        <w:spacing w:after="0" w:line="240" w:lineRule="auto"/>
+        <w:rPr>
+          <w:rFonts w:ascii="Segoe UI" w:eastAsia="Times New Roman" w:hAnsi="Segoe UI" w:cs="Segoe UI"/>
+          <w:b/>
+          <w:bCs/>
+          <w:kern w:val="0"/>
+          <w:bdr w:val="single" w:sz="2" w:space="0" w:color="auto" w:frame="1"/>
+          <w14:ligatures w14:val="none"/>
+        </w:rPr>
+      </w:pPr>
+    </w:p>
+    <w:p>
+      <w:pPr>
+        <w:pStyle w:val="NormalWeb"/>
+        <w:pBdr>
+          <w:top w:val="single" w:sz="2" w:space="0" w:color="auto"/>
+          <w:left w:val="single" w:sz="2" w:space="0" w:color="auto"/>
+          <w:bottom w:val="single" w:sz="2" w:space="0" w:color="auto"/>
+          <w:right w:val="single" w:sz="2" w:space="0" w:color="auto"/>
+        </w:pBdr>
+        <w:shd w:val="clear" w:color="auto" w:fill="FFFFFF"/>
+        <w:spacing w:before="0" w:beforeAutospacing="0" w:after="240" w:afterAutospacing="0"/>
+        <w:rPr>
+          <w:rFonts w:ascii="Segoe UI" w:hAnsi="Segoe UI" w:cs="Segoe UI"/>
+          <w:color w:val="5A5A5A"/>
+        </w:rPr>
+      </w:pPr>
+      <w:r>
+        <w:rPr>
+          <w:rFonts w:ascii="Segoe UI" w:hAnsi="Segoe UI" w:cs="Segoe UI"/>
+          <w:color w:val="5A5A5A"/>
+        </w:rPr>
+        <w:t xml:space="preserve">Although we are not using sliding </w:t>
+      </w:r>
+      <w:proofErr w:type="gramStart"/>
+      <w:r>
+        <w:rPr>
+          <w:rFonts w:ascii="Segoe UI" w:hAnsi="Segoe UI" w:cs="Segoe UI"/>
+          <w:color w:val="5A5A5A"/>
+        </w:rPr>
+        <w:t>window</w:t>
+      </w:r>
+      <w:proofErr w:type="gramEnd"/>
+      <w:r>
+        <w:rPr>
+          <w:rFonts w:ascii="Segoe UI" w:hAnsi="Segoe UI" w:cs="Segoe UI"/>
+          <w:color w:val="5A5A5A"/>
+        </w:rPr>
+        <w:t>, we can still use the same idea when it comes to "valid" subarrays.</w:t>
+      </w:r>
+    </w:p>
+    <w:p>
+      <w:pPr>
+        <w:pStyle w:val="NormalWeb"/>
+        <w:pBdr>
+          <w:top w:val="single" w:sz="2" w:space="0" w:color="auto"/>
+          <w:left w:val="single" w:sz="2" w:space="0" w:color="auto"/>
+          <w:bottom w:val="single" w:sz="2" w:space="0" w:color="auto"/>
+          <w:right w:val="single" w:sz="2" w:space="0" w:color="auto"/>
+        </w:pBdr>
+        <w:shd w:val="clear" w:color="auto" w:fill="FFFFFF"/>
+        <w:spacing w:before="0" w:beforeAutospacing="0" w:after="240" w:afterAutospacing="0"/>
+        <w:rPr>
+          <w:rFonts w:ascii="Segoe UI" w:hAnsi="Segoe UI" w:cs="Segoe UI"/>
+          <w:color w:val="5A5A5A"/>
+        </w:rPr>
+      </w:pPr>
+      <w:r>
+        <w:rPr>
+          <w:rFonts w:ascii="Segoe UI" w:hAnsi="Segoe UI" w:cs="Segoe UI"/>
+          <w:color w:val="5A5A5A"/>
+        </w:rPr>
+        <w:t>In the previous example, the constraint metric was "sum of a subarray" and the numeric restriction was </w:t>
+      </w:r>
+      <w:r>
+        <w:rPr>
+          <w:rStyle w:val="HTMLCode"/>
+          <w:rFonts w:ascii="Consolas" w:hAnsi="Consolas"/>
+          <w:color w:val="C7254E"/>
+          <w:sz w:val="24"/>
+          <w:szCs w:val="24"/>
+          <w:bdr w:val="single" w:sz="2" w:space="2" w:color="auto" w:frame="1"/>
+          <w:shd w:val="clear" w:color="auto" w:fill="F9F2F4"/>
+        </w:rPr>
+        <w:t>== k</w:t>
+      </w:r>
+      <w:r>
+        <w:rPr>
+          <w:rFonts w:ascii="Segoe UI" w:hAnsi="Segoe UI" w:cs="Segoe UI"/>
+          <w:color w:val="5A5A5A"/>
+        </w:rPr>
+        <w:t>.</w:t>
+      </w:r>
+    </w:p>
+    <w:p>
+      <w:pPr>
+        <w:pStyle w:val="NormalWeb"/>
+        <w:pBdr>
+          <w:top w:val="single" w:sz="2" w:space="0" w:color="auto"/>
+          <w:left w:val="single" w:sz="2" w:space="0" w:color="auto"/>
+          <w:bottom w:val="single" w:sz="2" w:space="0" w:color="auto"/>
+          <w:right w:val="single" w:sz="2" w:space="0" w:color="auto"/>
+        </w:pBdr>
+        <w:shd w:val="clear" w:color="auto" w:fill="FFFFFF"/>
+        <w:spacing w:before="0" w:beforeAutospacing="0" w:after="240" w:afterAutospacing="0"/>
+        <w:rPr>
+          <w:rFonts w:ascii="Segoe UI" w:hAnsi="Segoe UI" w:cs="Segoe UI"/>
+          <w:color w:val="5A5A5A"/>
+        </w:rPr>
+      </w:pPr>
+      <w:r>
+        <w:rPr>
+          <w:rFonts w:ascii="Segoe UI" w:hAnsi="Segoe UI" w:cs="Segoe UI"/>
+          <w:color w:val="5A5A5A"/>
+        </w:rPr>
+        <w:t>In this problem, the constraint metric is "count of odd numbers in a subarray" and the numeric restriction is also </w:t>
+      </w:r>
+      <w:r>
+        <w:rPr>
+          <w:rStyle w:val="HTMLCode"/>
+          <w:rFonts w:ascii="Consolas" w:hAnsi="Consolas"/>
+          <w:color w:val="C7254E"/>
+          <w:sz w:val="24"/>
+          <w:szCs w:val="24"/>
+          <w:bdr w:val="single" w:sz="2" w:space="2" w:color="auto" w:frame="1"/>
+          <w:shd w:val="clear" w:color="auto" w:fill="F9F2F4"/>
+        </w:rPr>
+        <w:t>== k</w:t>
+      </w:r>
+      <w:r>
+        <w:rPr>
+          <w:rFonts w:ascii="Segoe UI" w:hAnsi="Segoe UI" w:cs="Segoe UI"/>
+          <w:color w:val="5A5A5A"/>
+        </w:rPr>
+        <w:t>.</w:t>
+      </w:r>
+    </w:p>
+    <w:p>
+      <w:pPr>
+        <w:pStyle w:val="NormalWeb"/>
+        <w:pBdr>
+          <w:top w:val="single" w:sz="2" w:space="0" w:color="auto"/>
+          <w:left w:val="single" w:sz="2" w:space="0" w:color="auto"/>
+          <w:bottom w:val="single" w:sz="2" w:space="0" w:color="auto"/>
+          <w:right w:val="single" w:sz="2" w:space="0" w:color="auto"/>
+        </w:pBdr>
+        <w:shd w:val="clear" w:color="auto" w:fill="FFFFFF"/>
+        <w:spacing w:before="0" w:beforeAutospacing="0" w:after="240" w:afterAutospacing="0"/>
+        <w:rPr>
+          <w:rFonts w:ascii="Segoe UI" w:hAnsi="Segoe UI" w:cs="Segoe UI"/>
+          <w:color w:val="5A5A5A"/>
+        </w:rPr>
+      </w:pPr>
+      <w:r>
+        <w:rPr>
+          <w:rFonts w:ascii="Segoe UI" w:hAnsi="Segoe UI" w:cs="Segoe UI"/>
+          <w:color w:val="5A5A5A"/>
+        </w:rPr>
+        <w:lastRenderedPageBreak/>
+        <w:t xml:space="preserve">We </w:t>
+      </w:r>
+      <w:proofErr w:type="gramStart"/>
+      <w:r>
+        <w:rPr>
+          <w:rFonts w:ascii="Segoe UI" w:hAnsi="Segoe UI" w:cs="Segoe UI"/>
+          <w:color w:val="5A5A5A"/>
+        </w:rPr>
+        <w:t>have to</w:t>
+      </w:r>
+      <w:proofErr w:type="gramEnd"/>
+      <w:r>
+        <w:rPr>
+          <w:rFonts w:ascii="Segoe UI" w:hAnsi="Segoe UI" w:cs="Segoe UI"/>
+          <w:color w:val="5A5A5A"/>
+        </w:rPr>
+        <w:t xml:space="preserve"> get a little creative with prefix sums here. Instead of using </w:t>
+      </w:r>
+      <w:proofErr w:type="spellStart"/>
+      <w:proofErr w:type="gramStart"/>
+      <w:r>
+        <w:rPr>
+          <w:rStyle w:val="HTMLCode"/>
+          <w:rFonts w:ascii="Consolas" w:hAnsi="Consolas"/>
+          <w:color w:val="C7254E"/>
+          <w:sz w:val="24"/>
+          <w:szCs w:val="24"/>
+          <w:bdr w:val="single" w:sz="2" w:space="2" w:color="auto" w:frame="1"/>
+          <w:shd w:val="clear" w:color="auto" w:fill="F9F2F4"/>
+        </w:rPr>
+        <w:t>curr</w:t>
+      </w:r>
+      <w:proofErr w:type="spellEnd"/>
+      <w:proofErr w:type="gramEnd"/>
+      <w:r>
+        <w:rPr>
+          <w:rFonts w:ascii="Segoe UI" w:hAnsi="Segoe UI" w:cs="Segoe UI"/>
+          <w:color w:val="5A5A5A"/>
+        </w:rPr>
+        <w:t> to track prefix sum, we have it track the number of odd numbers we have seen in the current prefix. You could call it the "prefix odd count". If </w:t>
+      </w:r>
+      <w:proofErr w:type="spellStart"/>
+      <w:r>
+        <w:rPr>
+          <w:rStyle w:val="HTMLCode"/>
+          <w:rFonts w:ascii="Consolas" w:hAnsi="Consolas"/>
+          <w:color w:val="C7254E"/>
+          <w:sz w:val="24"/>
+          <w:szCs w:val="24"/>
+          <w:bdr w:val="single" w:sz="2" w:space="2" w:color="auto" w:frame="1"/>
+          <w:shd w:val="clear" w:color="auto" w:fill="F9F2F4"/>
+        </w:rPr>
+        <w:t>curr</w:t>
+      </w:r>
+      <w:proofErr w:type="spellEnd"/>
+      <w:r>
+        <w:rPr>
+          <w:rStyle w:val="HTMLCode"/>
+          <w:rFonts w:ascii="Consolas" w:hAnsi="Consolas"/>
+          <w:color w:val="C7254E"/>
+          <w:sz w:val="24"/>
+          <w:szCs w:val="24"/>
+          <w:bdr w:val="single" w:sz="2" w:space="2" w:color="auto" w:frame="1"/>
+          <w:shd w:val="clear" w:color="auto" w:fill="F9F2F4"/>
+        </w:rPr>
+        <w:t xml:space="preserve"> - k</w:t>
+      </w:r>
+      <w:r>
+        <w:rPr>
+          <w:rFonts w:ascii="Segoe UI" w:hAnsi="Segoe UI" w:cs="Segoe UI"/>
+          <w:color w:val="5A5A5A"/>
+        </w:rPr>
+        <w:t> exists, it means that there was a prefix earlier with </w:t>
+      </w:r>
+      <w:proofErr w:type="spellStart"/>
+      <w:r>
+        <w:rPr>
+          <w:rStyle w:val="HTMLCode"/>
+          <w:rFonts w:ascii="Consolas" w:hAnsi="Consolas"/>
+          <w:color w:val="C7254E"/>
+          <w:sz w:val="24"/>
+          <w:szCs w:val="24"/>
+          <w:bdr w:val="single" w:sz="2" w:space="2" w:color="auto" w:frame="1"/>
+          <w:shd w:val="clear" w:color="auto" w:fill="F9F2F4"/>
+        </w:rPr>
+        <w:t>curr</w:t>
+      </w:r>
+      <w:proofErr w:type="spellEnd"/>
+      <w:r>
+        <w:rPr>
+          <w:rStyle w:val="HTMLCode"/>
+          <w:rFonts w:ascii="Consolas" w:hAnsi="Consolas"/>
+          <w:color w:val="C7254E"/>
+          <w:sz w:val="24"/>
+          <w:szCs w:val="24"/>
+          <w:bdr w:val="single" w:sz="2" w:space="2" w:color="auto" w:frame="1"/>
+          <w:shd w:val="clear" w:color="auto" w:fill="F9F2F4"/>
+        </w:rPr>
+        <w:t xml:space="preserve"> - k</w:t>
+      </w:r>
+      <w:r>
+        <w:rPr>
+          <w:rFonts w:ascii="Segoe UI" w:hAnsi="Segoe UI" w:cs="Segoe UI"/>
+          <w:color w:val="5A5A5A"/>
+        </w:rPr>
+        <w:t> odd numbers. The current prefix has </w:t>
+      </w:r>
+      <w:proofErr w:type="spellStart"/>
+      <w:proofErr w:type="gramStart"/>
+      <w:r>
+        <w:rPr>
+          <w:rStyle w:val="HTMLCode"/>
+          <w:rFonts w:ascii="Consolas" w:hAnsi="Consolas"/>
+          <w:color w:val="C7254E"/>
+          <w:sz w:val="24"/>
+          <w:szCs w:val="24"/>
+          <w:bdr w:val="single" w:sz="2" w:space="2" w:color="auto" w:frame="1"/>
+          <w:shd w:val="clear" w:color="auto" w:fill="F9F2F4"/>
+        </w:rPr>
+        <w:t>curr</w:t>
+      </w:r>
+      <w:proofErr w:type="spellEnd"/>
+      <w:proofErr w:type="gramEnd"/>
+      <w:r>
+        <w:rPr>
+          <w:rFonts w:ascii="Segoe UI" w:hAnsi="Segoe UI" w:cs="Segoe UI"/>
+          <w:color w:val="5A5A5A"/>
+        </w:rPr>
+        <w:t> odd numbers. The difference between them represents the number of odd numbers in the subarray between the prefixes, which is </w:t>
+      </w:r>
+      <w:proofErr w:type="spellStart"/>
+      <w:r>
+        <w:rPr>
+          <w:rStyle w:val="HTMLCode"/>
+          <w:rFonts w:ascii="Consolas" w:hAnsi="Consolas"/>
+          <w:color w:val="C7254E"/>
+          <w:sz w:val="24"/>
+          <w:szCs w:val="24"/>
+          <w:bdr w:val="single" w:sz="2" w:space="2" w:color="auto" w:frame="1"/>
+          <w:shd w:val="clear" w:color="auto" w:fill="F9F2F4"/>
+        </w:rPr>
+        <w:t>curr</w:t>
+      </w:r>
+      <w:proofErr w:type="spellEnd"/>
+      <w:r>
+        <w:rPr>
+          <w:rStyle w:val="HTMLCode"/>
+          <w:rFonts w:ascii="Consolas" w:hAnsi="Consolas"/>
+          <w:color w:val="C7254E"/>
+          <w:sz w:val="24"/>
+          <w:szCs w:val="24"/>
+          <w:bdr w:val="single" w:sz="2" w:space="2" w:color="auto" w:frame="1"/>
+          <w:shd w:val="clear" w:color="auto" w:fill="F9F2F4"/>
+        </w:rPr>
+        <w:t xml:space="preserve"> - (</w:t>
+      </w:r>
+      <w:proofErr w:type="spellStart"/>
+      <w:proofErr w:type="gramStart"/>
+      <w:r>
+        <w:rPr>
+          <w:rStyle w:val="HTMLCode"/>
+          <w:rFonts w:ascii="Consolas" w:hAnsi="Consolas"/>
+          <w:color w:val="C7254E"/>
+          <w:sz w:val="24"/>
+          <w:szCs w:val="24"/>
+          <w:bdr w:val="single" w:sz="2" w:space="2" w:color="auto" w:frame="1"/>
+          <w:shd w:val="clear" w:color="auto" w:fill="F9F2F4"/>
+        </w:rPr>
+        <w:t>curr</w:t>
+      </w:r>
+      <w:proofErr w:type="spellEnd"/>
+      <w:proofErr w:type="gramEnd"/>
+      <w:r>
+        <w:rPr>
+          <w:rStyle w:val="HTMLCode"/>
+          <w:rFonts w:ascii="Consolas" w:hAnsi="Consolas"/>
+          <w:color w:val="C7254E"/>
+          <w:sz w:val="24"/>
+          <w:szCs w:val="24"/>
+          <w:bdr w:val="single" w:sz="2" w:space="2" w:color="auto" w:frame="1"/>
+          <w:shd w:val="clear" w:color="auto" w:fill="F9F2F4"/>
+        </w:rPr>
+        <w:t xml:space="preserve"> - k) = k</w:t>
+      </w:r>
+      <w:r>
+        <w:rPr>
+          <w:rFonts w:ascii="Segoe UI" w:hAnsi="Segoe UI" w:cs="Segoe UI"/>
+          <w:color w:val="5A5A5A"/>
+        </w:rPr>
+        <w:t> odd numbers.</w:t>
+      </w:r>
+    </w:p>
+    <w:p>
+      <w:pPr>
+        <w:pStyle w:val="NormalWeb"/>
+        <w:pBdr>
+          <w:top w:val="single" w:sz="2" w:space="0" w:color="auto"/>
+          <w:left w:val="single" w:sz="2" w:space="0" w:color="auto"/>
+          <w:bottom w:val="single" w:sz="2" w:space="0" w:color="auto"/>
+          <w:right w:val="single" w:sz="2" w:space="0" w:color="auto"/>
+        </w:pBdr>
+        <w:shd w:val="clear" w:color="auto" w:fill="FFFFFF"/>
+        <w:spacing w:before="0" w:beforeAutospacing="0" w:after="240" w:afterAutospacing="0"/>
+        <w:rPr>
+          <w:rFonts w:ascii="Segoe UI" w:hAnsi="Segoe UI" w:cs="Segoe UI"/>
+          <w:color w:val="5A5A5A"/>
+        </w:rPr>
+      </w:pPr>
+      <w:r>
+        <w:rPr>
+          <w:rFonts w:ascii="Segoe UI" w:hAnsi="Segoe UI" w:cs="Segoe UI"/>
+          <w:color w:val="5A5A5A"/>
+        </w:rPr>
+        <w:t xml:space="preserve">If a number is odd, then when you </w:t>
+      </w:r>
+      <w:proofErr w:type="gramStart"/>
+      <w:r>
+        <w:rPr>
+          <w:rFonts w:ascii="Segoe UI" w:hAnsi="Segoe UI" w:cs="Segoe UI"/>
+          <w:color w:val="5A5A5A"/>
+        </w:rPr>
+        <w:t>take it</w:t>
+      </w:r>
+      <w:proofErr w:type="gramEnd"/>
+      <w:r>
+        <w:rPr>
+          <w:rFonts w:ascii="Segoe UI" w:hAnsi="Segoe UI" w:cs="Segoe UI"/>
+          <w:color w:val="5A5A5A"/>
+        </w:rPr>
+        <w:t xml:space="preserve"> mod 2, the result will be </w:t>
+      </w:r>
+      <w:r>
+        <w:rPr>
+          <w:rStyle w:val="HTMLCode"/>
+          <w:rFonts w:ascii="Consolas" w:hAnsi="Consolas"/>
+          <w:color w:val="C7254E"/>
+          <w:sz w:val="24"/>
+          <w:szCs w:val="24"/>
+          <w:bdr w:val="single" w:sz="2" w:space="2" w:color="auto" w:frame="1"/>
+          <w:shd w:val="clear" w:color="auto" w:fill="F9F2F4"/>
+        </w:rPr>
+        <w:t>1</w:t>
+      </w:r>
+      <w:r>
+        <w:rPr>
+          <w:rFonts w:ascii="Segoe UI" w:hAnsi="Segoe UI" w:cs="Segoe UI"/>
+          <w:color w:val="5A5A5A"/>
+        </w:rPr>
+        <w:t>. Otherwise, it will be </w:t>
+      </w:r>
+      <w:r>
+        <w:rPr>
+          <w:rStyle w:val="HTMLCode"/>
+          <w:rFonts w:ascii="Consolas" w:hAnsi="Consolas"/>
+          <w:color w:val="C7254E"/>
+          <w:sz w:val="24"/>
+          <w:szCs w:val="24"/>
+          <w:bdr w:val="single" w:sz="2" w:space="2" w:color="auto" w:frame="1"/>
+          <w:shd w:val="clear" w:color="auto" w:fill="F9F2F4"/>
+        </w:rPr>
+        <w:t>0</w:t>
+      </w:r>
+      <w:r>
+        <w:rPr>
+          <w:rFonts w:ascii="Segoe UI" w:hAnsi="Segoe UI" w:cs="Segoe UI"/>
+          <w:color w:val="5A5A5A"/>
+        </w:rPr>
+        <w:t xml:space="preserve">. </w:t>
+      </w:r>
+      <w:proofErr w:type="gramStart"/>
+      <w:r>
+        <w:rPr>
+          <w:rFonts w:ascii="Segoe UI" w:hAnsi="Segoe UI" w:cs="Segoe UI"/>
+          <w:color w:val="5A5A5A"/>
+        </w:rPr>
+        <w:t>Therefore</w:t>
+      </w:r>
+      <w:proofErr w:type="gramEnd"/>
+      <w:r>
+        <w:rPr>
+          <w:rFonts w:ascii="Segoe UI" w:hAnsi="Segoe UI" w:cs="Segoe UI"/>
+          <w:color w:val="5A5A5A"/>
+        </w:rPr>
+        <w:t xml:space="preserve"> we can easily perform </w:t>
+      </w:r>
+      <w:proofErr w:type="spellStart"/>
+      <w:r>
+        <w:rPr>
+          <w:rStyle w:val="HTMLCode"/>
+          <w:rFonts w:ascii="Consolas" w:hAnsi="Consolas"/>
+          <w:color w:val="C7254E"/>
+          <w:sz w:val="24"/>
+          <w:szCs w:val="24"/>
+          <w:bdr w:val="single" w:sz="2" w:space="2" w:color="auto" w:frame="1"/>
+          <w:shd w:val="clear" w:color="auto" w:fill="F9F2F4"/>
+        </w:rPr>
+        <w:t>curr</w:t>
+      </w:r>
+      <w:proofErr w:type="spellEnd"/>
+      <w:r>
+        <w:rPr>
+          <w:rStyle w:val="HTMLCode"/>
+          <w:rFonts w:ascii="Consolas" w:hAnsi="Consolas"/>
+          <w:color w:val="C7254E"/>
+          <w:sz w:val="24"/>
+          <w:szCs w:val="24"/>
+          <w:bdr w:val="single" w:sz="2" w:space="2" w:color="auto" w:frame="1"/>
+          <w:shd w:val="clear" w:color="auto" w:fill="F9F2F4"/>
+        </w:rPr>
+        <w:t xml:space="preserve"> += num % 2</w:t>
+      </w:r>
+      <w:r>
+        <w:rPr>
+          <w:rFonts w:ascii="Segoe UI" w:hAnsi="Segoe UI" w:cs="Segoe UI"/>
+          <w:color w:val="5A5A5A"/>
+        </w:rPr>
+        <w:t> for each number.</w:t>
+      </w:r>
+    </w:p>
+    <w:p>
+      <w:pPr>
+        <w:pStyle w:val="NormalWeb"/>
+        <w:pBdr>
+          <w:top w:val="single" w:sz="2" w:space="0" w:color="auto"/>
+          <w:left w:val="single" w:sz="2" w:space="0" w:color="auto"/>
+          <w:bottom w:val="single" w:sz="2" w:space="0" w:color="auto"/>
+          <w:right w:val="single" w:sz="2" w:space="0" w:color="auto"/>
+        </w:pBdr>
+        <w:shd w:val="clear" w:color="auto" w:fill="FFFFFF"/>
+        <w:spacing w:before="0" w:beforeAutospacing="0" w:after="240" w:afterAutospacing="0"/>
+        <w:rPr>
+          <w:rFonts w:ascii="Segoe UI" w:hAnsi="Segoe UI" w:cs="Segoe UI"/>
+          <w:color w:val="5A5A5A"/>
+        </w:rPr>
+      </w:pPr>
+      <w:r>
+        <w:rPr>
+          <w:rFonts w:ascii="Segoe UI" w:hAnsi="Segoe UI" w:cs="Segoe UI"/>
+          <w:color w:val="5A5A5A"/>
+        </w:rPr>
+        <w:t>From here, everything else works the exact same way. Seriously, compare the code between the two problems.</w:t>
+      </w:r>
+    </w:p>
+    <w:p>
+      <w:pPr>
+        <w:shd w:val="clear" w:color="auto" w:fill="FFFFFF"/>
+        <w:spacing w:after="0" w:line="240" w:lineRule="auto"/>
+        <w:rPr>
+          <w:rFonts w:ascii="Segoe UI" w:eastAsia="Times New Roman" w:hAnsi="Segoe UI" w:cs="Segoe UI"/>
+          <w:b/>
+          <w:bCs/>
+          <w:kern w:val="0"/>
+          <w:bdr w:val="single" w:sz="2" w:space="0" w:color="auto" w:frame="1"/>
+          <w14:ligatures w14:val="none"/>
+        </w:rPr>
+      </w:pPr>
+    </w:p>
+    <w:p>
+      <w:pPr>
+        <w:shd w:val="clear" w:color="auto" w:fill="FFFFFF"/>
+        <w:spacing w:after="0" w:line="240" w:lineRule="auto"/>
+        <w:rPr>
+          <w:rFonts w:ascii="Segoe UI" w:eastAsia="Times New Roman" w:hAnsi="Segoe UI" w:cs="Segoe UI"/>
+          <w:kern w:val="0"/>
+          <w14:ligatures w14:val="none"/>
+        </w:rPr>
+      </w:pPr>
+      <w:r>
+        <w:rPr>
+          <w:rFonts w:ascii="Segoe UI" w:eastAsia="Times New Roman" w:hAnsi="Segoe UI" w:cs="Segoe UI"/>
+          <w:kern w:val="0"/>
+          <w14:ligatures w14:val="none"/>
+        </w:rPr>
+        <w:drawing>
+          <wp:inline distT="0" distB="0" distL="0" distR="0" wp14:anchorId="7C588C90" wp14:editId="001955E2">
+            <wp:extent cx="5943600" cy="2680335"/>
+            <wp:effectExtent l="0" t="0" r="0" b="5715"/>
+            <wp:docPr id="1755571454" name="Picture 1"/>
+            <wp:cNvGraphicFramePr>
+              <a:graphicFrameLocks xmlns:a="http://schemas.openxmlformats.org/drawingml/2006/main" noChangeAspect="1"/>
+            </wp:cNvGraphicFramePr>
+            <a:graphic xmlns:a="http://schemas.openxmlformats.org/drawingml/2006/main">
+              <a:graphicData uri="http://schemas.openxmlformats.org/drawingml/2006/picture">
+                <pic:pic xmlns:pic="http://schemas.openxmlformats.org/drawingml/2006/picture">
+                  <pic:nvPicPr>
+                    <pic:cNvPr id="1755571454" name=""/>
+                    <pic:cNvPicPr/>
+                  </pic:nvPicPr>
+                  <pic:blipFill>
+                    <a:blip r:embed="rId18"/>
+                    <a:stretch>
+                      <a:fillRect/>
+                    </a:stretch>
+                  </pic:blipFill>
+                  <pic:spPr>
+                    <a:xfrm>
+                      <a:off x="0" y="0"/>
+                      <a:ext cx="5943600" cy="2680335"/>
+                    </a:xfrm>
+                    <a:prstGeom prst="rect">
+                      <a:avLst/>
+                    </a:prstGeom>
+                  </pic:spPr>
+                </pic:pic>
+              </a:graphicData>
+            </a:graphic>
+          </wp:inline>
+        </w:drawing>
       </w:r>
     </w:p>
     <w:p>
@@ -9703,13 +10278,11 @@
           <w:kern w:val="0"/>
           <w14:ligatures w14:val="none"/>
         </w:rPr>
-        <w:lastRenderedPageBreak/>
         <w:pict w14:anchorId="21019AEA">
-          <v:rect id="_x0000_i1030" style="width:0;height:.75pt" o:hralign="center" o:hrstd="t" o:hr="t" fillcolor="#a0a0a0" stroked="f"/>
+          <v:rect id="_x0000_i1033" style="width:0;height:.75pt" o:hralign="center" o:hrstd="t" o:hr="t" fillcolor="#a0a0a0" stroked="f"/>
         </w:pict>
       </w:r>
     </w:p>
-    <w:p/>
     <w:sectPr>
       <w:pgSz w:w="12240" w:h="15840"/>
       <w:pgMar w:top="1440" w:right="1440" w:bottom="1440" w:left="1440" w:header="720" w:footer="720" w:gutter="0"/>
@@ -11168,7 +11741,6 @@
   <w:style w:type="character" w:default="1" w:styleId="DefaultParagraphFont">
     <w:name w:val="Default Paragraph Font"/>
     <w:uiPriority w:val="1"/>
-    <w:semiHidden/>
     <w:unhideWhenUsed/>
   </w:style>
   <w:style w:type="table" w:default="1" w:styleId="TableNormal">

</xml_diff>